<commit_message>
revise bronze to silver transformation v2
</commit_message>
<xml_diff>
--- a/reference/promptEngineering/prompts.docx
+++ b/reference/promptEngineering/prompts.docx
@@ -9,7 +9,6 @@
           <w:bCs/>
         </w:rPr>
       </w:pPr>
-      <w:proofErr w:type="spellStart"/>
       <w:r>
         <w:rPr>
           <w:b/>
@@ -17,7 +16,13 @@
         </w:rPr>
         <w:t>bronze_to_silver_transformation_prompt</w:t>
       </w:r>
-      <w:proofErr w:type="spellEnd"/>
+      <w:r>
+        <w:rPr>
+          <w:b/>
+          <w:bCs/>
+        </w:rPr>
+        <w:t>_v1</w:t>
+      </w:r>
     </w:p>
     <w:p>
       <w:pPr>
@@ -311,6 +316,596 @@
         <w:t>”</w:t>
       </w:r>
     </w:p>
+    <w:p>
+      <w:pPr>
+        <w:pStyle w:val="ListParagraph"/>
+      </w:pPr>
+    </w:p>
+    <w:p>
+      <w:pPr>
+        <w:rPr>
+          <w:b/>
+          <w:bCs/>
+        </w:rPr>
+      </w:pPr>
+      <w:r>
+        <w:rPr>
+          <w:b/>
+          <w:bCs/>
+        </w:rPr>
+        <w:t>bronze_to_silver_transformation_prompt</w:t>
+      </w:r>
+      <w:r>
+        <w:rPr>
+          <w:b/>
+          <w:bCs/>
+        </w:rPr>
+        <w:t>_v2</w:t>
+      </w:r>
+    </w:p>
+    <w:p/>
+    <w:p>
+      <w:pPr>
+        <w:pStyle w:val="ListParagraph"/>
+        <w:numPr>
+          <w:ilvl w:val="0"/>
+          <w:numId w:val="4"/>
+        </w:numPr>
+      </w:pPr>
+      <w:r>
+        <w:t xml:space="preserve">take my dataset in the </w:t>
+      </w:r>
+      <w:proofErr w:type="spellStart"/>
+      <w:r>
+        <w:t>dataanalytics</w:t>
+      </w:r>
+      <w:proofErr w:type="spellEnd"/>
+      <w:r>
+        <w:t xml:space="preserve"> </w:t>
+      </w:r>
+      <w:proofErr w:type="spellStart"/>
+      <w:r>
+        <w:t>catalog</w:t>
+      </w:r>
+      <w:proofErr w:type="spellEnd"/>
+      <w:r>
+        <w:t xml:space="preserve">, in ml1 schema, called </w:t>
+      </w:r>
+      <w:proofErr w:type="spellStart"/>
+      <w:r>
+        <w:t>loan_book_dirty</w:t>
+      </w:r>
+      <w:proofErr w:type="spellEnd"/>
+      <w:r>
+        <w:t>. This is the list of issues I want you to fix;</w:t>
+      </w:r>
+      <w:r>
+        <w:t xml:space="preserve"> </w:t>
+      </w:r>
+      <w:r>
+        <w:t>A. DATA TYPE FIXES:</w:t>
+      </w:r>
+      <w:r>
+        <w:t xml:space="preserve"> standardise</w:t>
+      </w:r>
+      <w:r>
+        <w:t xml:space="preserve"> </w:t>
+      </w:r>
+      <w:proofErr w:type="spellStart"/>
+      <w:r>
+        <w:t>application_date</w:t>
+      </w:r>
+      <w:proofErr w:type="spellEnd"/>
+      <w:r>
+        <w:t xml:space="preserve"> handling three different date formats</w:t>
+      </w:r>
+      <w:r>
+        <w:t>;</w:t>
+      </w:r>
+      <w:r>
+        <w:t xml:space="preserve"> </w:t>
+      </w:r>
+      <w:r>
+        <w:t xml:space="preserve">Convert </w:t>
+      </w:r>
+      <w:proofErr w:type="spellStart"/>
+      <w:r>
+        <w:t>num_open_accounts</w:t>
+      </w:r>
+      <w:proofErr w:type="spellEnd"/>
+      <w:r>
+        <w:t xml:space="preserve"> from double to integer</w:t>
+      </w:r>
+      <w:r>
+        <w:t>;</w:t>
+      </w:r>
+      <w:r>
+        <w:t xml:space="preserve"> </w:t>
+      </w:r>
+      <w:r>
+        <w:t>round</w:t>
+      </w:r>
+      <w:r>
+        <w:t xml:space="preserve"> age to nearest whole number (integer)</w:t>
+      </w:r>
+      <w:r>
+        <w:t xml:space="preserve">. B. </w:t>
+      </w:r>
+      <w:r>
+        <w:t>Deduplicate by keeping only one record per </w:t>
+      </w:r>
+      <w:proofErr w:type="spellStart"/>
+      <w:r>
+        <w:t>applicant_id_</w:t>
+      </w:r>
+      <w:r>
+        <w:t>hash</w:t>
+      </w:r>
+      <w:proofErr w:type="spellEnd"/>
+      <w:r>
+        <w:t xml:space="preserve">. C. </w:t>
+      </w:r>
+      <w:r>
+        <w:t>categorical standardisation</w:t>
+      </w:r>
+      <w:r>
+        <w:t>:</w:t>
+      </w:r>
+      <w:r>
+        <w:t xml:space="preserve"> </w:t>
+      </w:r>
+      <w:r>
+        <w:t>Standardi</w:t>
+      </w:r>
+      <w:r>
+        <w:t>s</w:t>
+      </w:r>
+      <w:r>
+        <w:t xml:space="preserve">e </w:t>
+      </w:r>
+      <w:proofErr w:type="spellStart"/>
+      <w:r>
+        <w:t>loan_purpose</w:t>
+      </w:r>
+      <w:proofErr w:type="spellEnd"/>
+      <w:r>
+        <w:t>: consolidate 21 variations into 7 actual categories</w:t>
+      </w:r>
+      <w:r>
+        <w:t>;</w:t>
+      </w:r>
+      <w:r>
+        <w:t xml:space="preserve"> Standardi</w:t>
+      </w:r>
+      <w:r>
+        <w:t>s</w:t>
+      </w:r>
+      <w:r>
+        <w:t xml:space="preserve">e </w:t>
+      </w:r>
+      <w:proofErr w:type="spellStart"/>
+      <w:r>
+        <w:t>home_ownership</w:t>
+      </w:r>
+      <w:proofErr w:type="spellEnd"/>
+      <w:r>
+        <w:t>: consolidate 14 variations into 4 actual categories (MORTGAGE, RENT, OWN, OTHER)</w:t>
+      </w:r>
+      <w:r>
+        <w:t xml:space="preserve">. D. </w:t>
+      </w:r>
+      <w:r>
+        <w:t>MISSING VALUE TREATMENT:</w:t>
+      </w:r>
+      <w:r>
+        <w:t xml:space="preserve"> </w:t>
+      </w:r>
+      <w:proofErr w:type="spellStart"/>
+      <w:r>
+        <w:t>annual_income</w:t>
+      </w:r>
+      <w:proofErr w:type="spellEnd"/>
+      <w:r>
+        <w:t>:</w:t>
+      </w:r>
+      <w:r>
+        <w:t xml:space="preserve"> </w:t>
+      </w:r>
+      <w:r>
+        <w:t xml:space="preserve">Create </w:t>
+      </w:r>
+      <w:proofErr w:type="spellStart"/>
+      <w:r>
+        <w:t>income_missing</w:t>
+      </w:r>
+      <w:proofErr w:type="spellEnd"/>
+      <w:r>
+        <w:t xml:space="preserve"> flag </w:t>
+      </w:r>
+      <w:r>
+        <w:lastRenderedPageBreak/>
+        <w:t>(Boolean), impute nulls with median</w:t>
+      </w:r>
+      <w:r>
+        <w:t>;</w:t>
+      </w:r>
+      <w:r>
+        <w:t xml:space="preserve"> </w:t>
+      </w:r>
+      <w:proofErr w:type="spellStart"/>
+      <w:r>
+        <w:t>months_since_last_delinquency</w:t>
+      </w:r>
+      <w:proofErr w:type="spellEnd"/>
+      <w:r>
+        <w:t xml:space="preserve">: Create </w:t>
+      </w:r>
+      <w:proofErr w:type="spellStart"/>
+      <w:r>
+        <w:t>has_delinquency_history</w:t>
+      </w:r>
+      <w:proofErr w:type="spellEnd"/>
+      <w:r>
+        <w:t xml:space="preserve"> flag (Boolean)</w:t>
+      </w:r>
+      <w:r>
+        <w:t xml:space="preserve"> </w:t>
+      </w:r>
+      <w:r>
+        <w:t>fill nulls with -1, then RECODE -1 to 999 to avoid negative values in logistic regressio</w:t>
+      </w:r>
+      <w:r>
+        <w:t>n</w:t>
+      </w:r>
+      <w:r>
+        <w:t>;</w:t>
+      </w:r>
+      <w:r>
+        <w:t xml:space="preserve"> </w:t>
+      </w:r>
+      <w:proofErr w:type="spellStart"/>
+      <w:r>
+        <w:t>employment_length_years</w:t>
+      </w:r>
+      <w:proofErr w:type="spellEnd"/>
+      <w:r>
+        <w:t xml:space="preserve">: Create </w:t>
+      </w:r>
+      <w:proofErr w:type="spellStart"/>
+      <w:r>
+        <w:t>employment_missing</w:t>
+      </w:r>
+      <w:proofErr w:type="spellEnd"/>
+      <w:r>
+        <w:t xml:space="preserve"> flag (Boolean)</w:t>
+      </w:r>
+      <w:r>
+        <w:t xml:space="preserve"> </w:t>
+      </w:r>
+      <w:r>
+        <w:t>impute nulls with 0</w:t>
+      </w:r>
+      <w:r>
+        <w:t>;</w:t>
+      </w:r>
+      <w:r>
+        <w:t xml:space="preserve"> </w:t>
+      </w:r>
+      <w:r>
+        <w:t xml:space="preserve"> </w:t>
+      </w:r>
+      <w:proofErr w:type="spellStart"/>
+      <w:r>
+        <w:t>num_open_accounts</w:t>
+      </w:r>
+      <w:proofErr w:type="spellEnd"/>
+      <w:r>
+        <w:t xml:space="preserve">: Create </w:t>
+      </w:r>
+      <w:proofErr w:type="spellStart"/>
+      <w:r>
+        <w:t>num_accounts_missing</w:t>
+      </w:r>
+      <w:proofErr w:type="spellEnd"/>
+      <w:r>
+        <w:t xml:space="preserve"> flag (Boolean)</w:t>
+      </w:r>
+      <w:r>
+        <w:t xml:space="preserve"> </w:t>
+      </w:r>
+      <w:r>
+        <w:t>impute nulls with median</w:t>
+      </w:r>
+      <w:r>
+        <w:t xml:space="preserve">. E. </w:t>
+      </w:r>
+      <w:r>
+        <w:t xml:space="preserve">DATA QUALITY FIXES: Cap </w:t>
+      </w:r>
+      <w:proofErr w:type="spellStart"/>
+      <w:r>
+        <w:t>credit_utilisation_pct</w:t>
+      </w:r>
+      <w:proofErr w:type="spellEnd"/>
+      <w:r>
+        <w:t xml:space="preserve"> at 100</w:t>
+      </w:r>
+      <w:r>
+        <w:t>%</w:t>
+      </w:r>
+      <w:r>
+        <w:t xml:space="preserve"> (currently has values up to 106.2%)</w:t>
+      </w:r>
+      <w:r>
+        <w:t xml:space="preserve">; </w:t>
+      </w:r>
+      <w:r>
+        <w:t xml:space="preserve">Ensure all month columns are non-negative: </w:t>
+      </w:r>
+      <w:proofErr w:type="spellStart"/>
+      <w:r>
+        <w:t>months_since_oldest_account</w:t>
+      </w:r>
+      <w:proofErr w:type="spellEnd"/>
+      <w:r>
+        <w:t xml:space="preserve">, </w:t>
+      </w:r>
+      <w:proofErr w:type="spellStart"/>
+      <w:r>
+        <w:t>months_since_last_delinquency</w:t>
+      </w:r>
+      <w:proofErr w:type="spellEnd"/>
+      <w:r>
+        <w:t xml:space="preserve"> (after recoding -1 to 999), </w:t>
+      </w:r>
+      <w:proofErr w:type="spellStart"/>
+      <w:r>
+        <w:t>months_at_current_address</w:t>
+      </w:r>
+      <w:proofErr w:type="spellEnd"/>
+      <w:r>
+        <w:t xml:space="preserve">. F. </w:t>
+      </w:r>
+      <w:r>
+        <w:t>OUTLIER TREATMENT</w:t>
+      </w:r>
+      <w:r>
+        <w:t xml:space="preserve">: </w:t>
+      </w:r>
+      <w:r>
+        <w:t xml:space="preserve">Cap </w:t>
+      </w:r>
+      <w:proofErr w:type="spellStart"/>
+      <w:r>
+        <w:t>annual_income</w:t>
+      </w:r>
+      <w:proofErr w:type="spellEnd"/>
+      <w:r>
+        <w:t xml:space="preserve"> at 99th percentile to handle extreme outliers (max is $2M)</w:t>
+      </w:r>
+      <w:r>
+        <w:t xml:space="preserve">; </w:t>
+      </w:r>
+      <w:r>
+        <w:t xml:space="preserve">Cap </w:t>
+      </w:r>
+      <w:proofErr w:type="spellStart"/>
+      <w:r>
+        <w:t>loan_amount</w:t>
+      </w:r>
+      <w:proofErr w:type="spellEnd"/>
+      <w:r>
+        <w:t xml:space="preserve"> at 99th percentile to handle extreme values (max is $497K)</w:t>
+      </w:r>
+      <w:r>
+        <w:t xml:space="preserve">; </w:t>
+      </w:r>
+      <w:r>
+        <w:t xml:space="preserve">Cap </w:t>
+      </w:r>
+      <w:proofErr w:type="spellStart"/>
+      <w:r>
+        <w:t>total_revolving_balance</w:t>
+      </w:r>
+      <w:proofErr w:type="spellEnd"/>
+      <w:r>
+        <w:t xml:space="preserve"> at 99th percentile</w:t>
+      </w:r>
+      <w:r>
+        <w:t xml:space="preserve">. G. </w:t>
+      </w:r>
+      <w:r>
+        <w:t>FEATURE ENGINEERING FOR INTERPRETABILITY:</w:t>
+      </w:r>
+      <w:r>
+        <w:t xml:space="preserve"> </w:t>
+      </w:r>
+      <w:r>
+        <w:t xml:space="preserve">Create </w:t>
+      </w:r>
+      <w:proofErr w:type="spellStart"/>
+      <w:r>
+        <w:t>delinquency_category</w:t>
+      </w:r>
+      <w:proofErr w:type="spellEnd"/>
+      <w:r>
+        <w:t>: "</w:t>
+      </w:r>
+      <w:proofErr w:type="spellStart"/>
+      <w:r>
+        <w:t>No_History</w:t>
+      </w:r>
+      <w:proofErr w:type="spellEnd"/>
+      <w:r>
+        <w:t>" (</w:t>
+      </w:r>
+      <w:proofErr w:type="spellStart"/>
+      <w:r>
+        <w:t>months_since_last_delinquency</w:t>
+      </w:r>
+      <w:proofErr w:type="spellEnd"/>
+      <w:r>
+        <w:t xml:space="preserve"> = 999), "Recent_0-12mo" (0-12), "Moderate_12-36mo" (12-36), "Old_36mo+" (&gt;36)</w:t>
+      </w:r>
+      <w:r>
+        <w:t xml:space="preserve">; </w:t>
+      </w:r>
+      <w:r>
+        <w:t xml:space="preserve">Create </w:t>
+      </w:r>
+      <w:proofErr w:type="spellStart"/>
+      <w:r>
+        <w:t>incomplete_observation_window</w:t>
+      </w:r>
+      <w:proofErr w:type="spellEnd"/>
+      <w:r>
+        <w:t xml:space="preserve"> flag: TRUE if </w:t>
+      </w:r>
+      <w:proofErr w:type="spellStart"/>
+      <w:r>
+        <w:t>application_date</w:t>
+      </w:r>
+      <w:proofErr w:type="spellEnd"/>
+      <w:r>
+        <w:t xml:space="preserve"> is after 2022-12-31 (loans from late 2023 may not have full 12-month default observation)</w:t>
+      </w:r>
+      <w:r>
+        <w:t xml:space="preserve">. H. </w:t>
+      </w:r>
+      <w:r>
+        <w:t>TRAIN/TEST SPLIT INTEGRITY:</w:t>
+      </w:r>
+      <w:r>
+        <w:t xml:space="preserve"> </w:t>
+      </w:r>
+      <w:r>
+        <w:t>Ensure the existing 'set' column (train/test) is preserved</w:t>
+      </w:r>
+      <w:r>
+        <w:t>;</w:t>
+      </w:r>
+      <w:r>
+        <w:t xml:space="preserve"> After deduplication, verify no </w:t>
+      </w:r>
+      <w:proofErr w:type="spellStart"/>
+      <w:r>
+        <w:t>applicant_id_hash</w:t>
+      </w:r>
+      <w:proofErr w:type="spellEnd"/>
+      <w:r>
+        <w:t xml:space="preserve"> appears in both train and test</w:t>
+      </w:r>
+      <w:r>
+        <w:t xml:space="preserve">. I. </w:t>
+      </w:r>
+      <w:r>
+        <w:t>FINAL VALIDATION:</w:t>
+      </w:r>
+      <w:r>
+        <w:t xml:space="preserve"> </w:t>
+      </w:r>
+      <w:r>
+        <w:t xml:space="preserve">Verify no duplicate </w:t>
+      </w:r>
+      <w:proofErr w:type="spellStart"/>
+      <w:r>
+        <w:t>applicant_id_hash</w:t>
+      </w:r>
+      <w:proofErr w:type="spellEnd"/>
+      <w:r>
+        <w:t xml:space="preserve"> remains</w:t>
+      </w:r>
+      <w:r>
+        <w:t>,</w:t>
+      </w:r>
+      <w:r>
+        <w:t xml:space="preserve"> </w:t>
+      </w:r>
+      <w:r>
+        <w:t>verify</w:t>
+      </w:r>
+      <w:r>
+        <w:t xml:space="preserve"> no null values in critical features (after imputation)</w:t>
+      </w:r>
+      <w:r>
+        <w:t xml:space="preserve">, </w:t>
+      </w:r>
+      <w:r>
+        <w:t xml:space="preserve">Verify </w:t>
+      </w:r>
+      <w:proofErr w:type="spellStart"/>
+      <w:r>
+        <w:t>credit_utilisation_pct</w:t>
+      </w:r>
+      <w:proofErr w:type="spellEnd"/>
+      <w:r>
+        <w:t xml:space="preserve"> &lt;= 100</w:t>
+      </w:r>
+      <w:r>
+        <w:t xml:space="preserve">, </w:t>
+      </w:r>
+      <w:r>
+        <w:t xml:space="preserve">Verify all month columns &gt;= 0 (except </w:t>
+      </w:r>
+      <w:proofErr w:type="spellStart"/>
+      <w:r>
+        <w:t>months_since_last_delinquency</w:t>
+      </w:r>
+      <w:proofErr w:type="spellEnd"/>
+      <w:r>
+        <w:t xml:space="preserve"> which should be 999 for no history)</w:t>
+      </w:r>
+      <w:r>
+        <w:t>. U</w:t>
+      </w:r>
+      <w:r>
+        <w:t xml:space="preserve">se python and pandas and </w:t>
+      </w:r>
+      <w:r>
+        <w:t>don’t</w:t>
+      </w:r>
+      <w:r>
+        <w:t xml:space="preserve"> show intermediate print statements</w:t>
+      </w:r>
+      <w:r>
+        <w:t xml:space="preserve">. </w:t>
+      </w:r>
+      <w:r>
+        <w:t>just display the cleaned table</w:t>
+      </w:r>
+      <w:r>
+        <w:t xml:space="preserve"> name it </w:t>
+      </w:r>
+      <w:r>
+        <w:t>loan_book_silver</w:t>
+      </w:r>
+      <w:r>
+        <w:t>_v2.</w:t>
+      </w:r>
+    </w:p>
+    <w:p/>
+    <w:p>
+      <w:pPr>
+        <w:ind w:left="360"/>
+      </w:pPr>
+    </w:p>
+    <w:p>
+      <w:r>
+        <w:t xml:space="preserve">   </w:t>
+      </w:r>
+    </w:p>
+    <w:p/>
+    <w:p>
+      <w:r>
+        <w:t xml:space="preserve"> </w:t>
+      </w:r>
+    </w:p>
+    <w:p>
+      <w:pPr>
+        <w:pStyle w:val="ListParagraph"/>
+      </w:pPr>
+    </w:p>
+    <w:p/>
     <w:p/>
     <w:sectPr>
       <w:pgSz w:w="11906" w:h="16838"/>
@@ -411,6 +1006,181 @@
     </w:lvl>
   </w:abstractNum>
   <w:abstractNum w:abstractNumId="1" w15:restartNumberingAfterBreak="0">
+    <w:nsid w:val="2F98299B"/>
+    <w:multiLevelType w:val="hybridMultilevel"/>
+    <w:tmpl w:val="00EEF028"/>
+    <w:lvl w:ilvl="0" w:tplc="1C09000F">
+      <w:start w:val="1"/>
+      <w:numFmt w:val="decimal"/>
+      <w:lvlText w:val="%1."/>
+      <w:lvlJc w:val="left"/>
+      <w:pPr>
+        <w:ind w:left="720" w:hanging="360"/>
+      </w:pPr>
+      <w:rPr>
+        <w:rFonts w:hint="default"/>
+      </w:rPr>
+    </w:lvl>
+    <w:lvl w:ilvl="1" w:tplc="1C090019" w:tentative="1">
+      <w:start w:val="1"/>
+      <w:numFmt w:val="lowerLetter"/>
+      <w:lvlText w:val="%2."/>
+      <w:lvlJc w:val="left"/>
+      <w:pPr>
+        <w:ind w:left="1440" w:hanging="360"/>
+      </w:pPr>
+    </w:lvl>
+    <w:lvl w:ilvl="2" w:tplc="1C09001B" w:tentative="1">
+      <w:start w:val="1"/>
+      <w:numFmt w:val="lowerRoman"/>
+      <w:lvlText w:val="%3."/>
+      <w:lvlJc w:val="right"/>
+      <w:pPr>
+        <w:ind w:left="2160" w:hanging="180"/>
+      </w:pPr>
+    </w:lvl>
+    <w:lvl w:ilvl="3" w:tplc="1C09000F" w:tentative="1">
+      <w:start w:val="1"/>
+      <w:numFmt w:val="decimal"/>
+      <w:lvlText w:val="%4."/>
+      <w:lvlJc w:val="left"/>
+      <w:pPr>
+        <w:ind w:left="2880" w:hanging="360"/>
+      </w:pPr>
+    </w:lvl>
+    <w:lvl w:ilvl="4" w:tplc="1C090019" w:tentative="1">
+      <w:start w:val="1"/>
+      <w:numFmt w:val="lowerLetter"/>
+      <w:lvlText w:val="%5."/>
+      <w:lvlJc w:val="left"/>
+      <w:pPr>
+        <w:ind w:left="3600" w:hanging="360"/>
+      </w:pPr>
+    </w:lvl>
+    <w:lvl w:ilvl="5" w:tplc="1C09001B" w:tentative="1">
+      <w:start w:val="1"/>
+      <w:numFmt w:val="lowerRoman"/>
+      <w:lvlText w:val="%6."/>
+      <w:lvlJc w:val="right"/>
+      <w:pPr>
+        <w:ind w:left="4320" w:hanging="180"/>
+      </w:pPr>
+    </w:lvl>
+    <w:lvl w:ilvl="6" w:tplc="1C09000F" w:tentative="1">
+      <w:start w:val="1"/>
+      <w:numFmt w:val="decimal"/>
+      <w:lvlText w:val="%7."/>
+      <w:lvlJc w:val="left"/>
+      <w:pPr>
+        <w:ind w:left="5040" w:hanging="360"/>
+      </w:pPr>
+    </w:lvl>
+    <w:lvl w:ilvl="7" w:tplc="1C090019" w:tentative="1">
+      <w:start w:val="1"/>
+      <w:numFmt w:val="lowerLetter"/>
+      <w:lvlText w:val="%8."/>
+      <w:lvlJc w:val="left"/>
+      <w:pPr>
+        <w:ind w:left="5760" w:hanging="360"/>
+      </w:pPr>
+    </w:lvl>
+    <w:lvl w:ilvl="8" w:tplc="1C09001B" w:tentative="1">
+      <w:start w:val="1"/>
+      <w:numFmt w:val="lowerRoman"/>
+      <w:lvlText w:val="%9."/>
+      <w:lvlJc w:val="right"/>
+      <w:pPr>
+        <w:ind w:left="6480" w:hanging="180"/>
+      </w:pPr>
+    </w:lvl>
+  </w:abstractNum>
+  <w:abstractNum w:abstractNumId="2" w15:restartNumberingAfterBreak="0">
+    <w:nsid w:val="3CF95D15"/>
+    <w:multiLevelType w:val="hybridMultilevel"/>
+    <w:tmpl w:val="8B280344"/>
+    <w:lvl w:ilvl="0" w:tplc="FFFFFFFF">
+      <w:start w:val="1"/>
+      <w:numFmt w:val="decimal"/>
+      <w:lvlText w:val="%1."/>
+      <w:lvlJc w:val="left"/>
+      <w:pPr>
+        <w:ind w:left="720" w:hanging="360"/>
+      </w:pPr>
+    </w:lvl>
+    <w:lvl w:ilvl="1" w:tplc="FFFFFFFF" w:tentative="1">
+      <w:start w:val="1"/>
+      <w:numFmt w:val="lowerLetter"/>
+      <w:lvlText w:val="%2."/>
+      <w:lvlJc w:val="left"/>
+      <w:pPr>
+        <w:ind w:left="1440" w:hanging="360"/>
+      </w:pPr>
+    </w:lvl>
+    <w:lvl w:ilvl="2" w:tplc="FFFFFFFF" w:tentative="1">
+      <w:start w:val="1"/>
+      <w:numFmt w:val="lowerRoman"/>
+      <w:lvlText w:val="%3."/>
+      <w:lvlJc w:val="right"/>
+      <w:pPr>
+        <w:ind w:left="2160" w:hanging="180"/>
+      </w:pPr>
+    </w:lvl>
+    <w:lvl w:ilvl="3" w:tplc="FFFFFFFF" w:tentative="1">
+      <w:start w:val="1"/>
+      <w:numFmt w:val="decimal"/>
+      <w:lvlText w:val="%4."/>
+      <w:lvlJc w:val="left"/>
+      <w:pPr>
+        <w:ind w:left="2880" w:hanging="360"/>
+      </w:pPr>
+    </w:lvl>
+    <w:lvl w:ilvl="4" w:tplc="FFFFFFFF" w:tentative="1">
+      <w:start w:val="1"/>
+      <w:numFmt w:val="lowerLetter"/>
+      <w:lvlText w:val="%5."/>
+      <w:lvlJc w:val="left"/>
+      <w:pPr>
+        <w:ind w:left="3600" w:hanging="360"/>
+      </w:pPr>
+    </w:lvl>
+    <w:lvl w:ilvl="5" w:tplc="FFFFFFFF" w:tentative="1">
+      <w:start w:val="1"/>
+      <w:numFmt w:val="lowerRoman"/>
+      <w:lvlText w:val="%6."/>
+      <w:lvlJc w:val="right"/>
+      <w:pPr>
+        <w:ind w:left="4320" w:hanging="180"/>
+      </w:pPr>
+    </w:lvl>
+    <w:lvl w:ilvl="6" w:tplc="FFFFFFFF" w:tentative="1">
+      <w:start w:val="1"/>
+      <w:numFmt w:val="decimal"/>
+      <w:lvlText w:val="%7."/>
+      <w:lvlJc w:val="left"/>
+      <w:pPr>
+        <w:ind w:left="5040" w:hanging="360"/>
+      </w:pPr>
+    </w:lvl>
+    <w:lvl w:ilvl="7" w:tplc="FFFFFFFF" w:tentative="1">
+      <w:start w:val="1"/>
+      <w:numFmt w:val="lowerLetter"/>
+      <w:lvlText w:val="%8."/>
+      <w:lvlJc w:val="left"/>
+      <w:pPr>
+        <w:ind w:left="5760" w:hanging="360"/>
+      </w:pPr>
+    </w:lvl>
+    <w:lvl w:ilvl="8" w:tplc="FFFFFFFF" w:tentative="1">
+      <w:start w:val="1"/>
+      <w:numFmt w:val="lowerRoman"/>
+      <w:lvlText w:val="%9."/>
+      <w:lvlJc w:val="right"/>
+      <w:pPr>
+        <w:ind w:left="6480" w:hanging="180"/>
+      </w:pPr>
+    </w:lvl>
+  </w:abstractNum>
+  <w:abstractNum w:abstractNumId="3" w15:restartNumberingAfterBreak="0">
     <w:nsid w:val="59D3470A"/>
     <w:multiLevelType w:val="hybridMultilevel"/>
     <w:tmpl w:val="1FEC12C6"/>
@@ -523,11 +1293,169 @@
       </w:rPr>
     </w:lvl>
   </w:abstractNum>
+  <w:abstractNum w:abstractNumId="4" w15:restartNumberingAfterBreak="0">
+    <w:nsid w:val="76DC353B"/>
+    <w:multiLevelType w:val="multilevel"/>
+    <w:tmpl w:val="9F3E9490"/>
+    <w:lvl w:ilvl="0">
+      <w:start w:val="1"/>
+      <w:numFmt w:val="bullet"/>
+      <w:lvlText w:val=""/>
+      <w:lvlJc w:val="left"/>
+      <w:pPr>
+        <w:tabs>
+          <w:tab w:val="num" w:pos="720"/>
+        </w:tabs>
+        <w:ind w:left="720" w:hanging="360"/>
+      </w:pPr>
+      <w:rPr>
+        <w:rFonts w:ascii="Symbol" w:hAnsi="Symbol" w:hint="default"/>
+        <w:sz w:val="20"/>
+      </w:rPr>
+    </w:lvl>
+    <w:lvl w:ilvl="1" w:tentative="1">
+      <w:start w:val="1"/>
+      <w:numFmt w:val="bullet"/>
+      <w:lvlText w:val="o"/>
+      <w:lvlJc w:val="left"/>
+      <w:pPr>
+        <w:tabs>
+          <w:tab w:val="num" w:pos="1440"/>
+        </w:tabs>
+        <w:ind w:left="1440" w:hanging="360"/>
+      </w:pPr>
+      <w:rPr>
+        <w:rFonts w:ascii="Courier New" w:hAnsi="Courier New" w:hint="default"/>
+        <w:sz w:val="20"/>
+      </w:rPr>
+    </w:lvl>
+    <w:lvl w:ilvl="2" w:tentative="1">
+      <w:start w:val="1"/>
+      <w:numFmt w:val="bullet"/>
+      <w:lvlText w:val=""/>
+      <w:lvlJc w:val="left"/>
+      <w:pPr>
+        <w:tabs>
+          <w:tab w:val="num" w:pos="2160"/>
+        </w:tabs>
+        <w:ind w:left="2160" w:hanging="360"/>
+      </w:pPr>
+      <w:rPr>
+        <w:rFonts w:ascii="Wingdings" w:hAnsi="Wingdings" w:hint="default"/>
+        <w:sz w:val="20"/>
+      </w:rPr>
+    </w:lvl>
+    <w:lvl w:ilvl="3" w:tentative="1">
+      <w:start w:val="1"/>
+      <w:numFmt w:val="bullet"/>
+      <w:lvlText w:val=""/>
+      <w:lvlJc w:val="left"/>
+      <w:pPr>
+        <w:tabs>
+          <w:tab w:val="num" w:pos="2880"/>
+        </w:tabs>
+        <w:ind w:left="2880" w:hanging="360"/>
+      </w:pPr>
+      <w:rPr>
+        <w:rFonts w:ascii="Wingdings" w:hAnsi="Wingdings" w:hint="default"/>
+        <w:sz w:val="20"/>
+      </w:rPr>
+    </w:lvl>
+    <w:lvl w:ilvl="4" w:tentative="1">
+      <w:start w:val="1"/>
+      <w:numFmt w:val="bullet"/>
+      <w:lvlText w:val=""/>
+      <w:lvlJc w:val="left"/>
+      <w:pPr>
+        <w:tabs>
+          <w:tab w:val="num" w:pos="3600"/>
+        </w:tabs>
+        <w:ind w:left="3600" w:hanging="360"/>
+      </w:pPr>
+      <w:rPr>
+        <w:rFonts w:ascii="Wingdings" w:hAnsi="Wingdings" w:hint="default"/>
+        <w:sz w:val="20"/>
+      </w:rPr>
+    </w:lvl>
+    <w:lvl w:ilvl="5" w:tentative="1">
+      <w:start w:val="1"/>
+      <w:numFmt w:val="bullet"/>
+      <w:lvlText w:val=""/>
+      <w:lvlJc w:val="left"/>
+      <w:pPr>
+        <w:tabs>
+          <w:tab w:val="num" w:pos="4320"/>
+        </w:tabs>
+        <w:ind w:left="4320" w:hanging="360"/>
+      </w:pPr>
+      <w:rPr>
+        <w:rFonts w:ascii="Wingdings" w:hAnsi="Wingdings" w:hint="default"/>
+        <w:sz w:val="20"/>
+      </w:rPr>
+    </w:lvl>
+    <w:lvl w:ilvl="6" w:tentative="1">
+      <w:start w:val="1"/>
+      <w:numFmt w:val="bullet"/>
+      <w:lvlText w:val=""/>
+      <w:lvlJc w:val="left"/>
+      <w:pPr>
+        <w:tabs>
+          <w:tab w:val="num" w:pos="5040"/>
+        </w:tabs>
+        <w:ind w:left="5040" w:hanging="360"/>
+      </w:pPr>
+      <w:rPr>
+        <w:rFonts w:ascii="Wingdings" w:hAnsi="Wingdings" w:hint="default"/>
+        <w:sz w:val="20"/>
+      </w:rPr>
+    </w:lvl>
+    <w:lvl w:ilvl="7" w:tentative="1">
+      <w:start w:val="1"/>
+      <w:numFmt w:val="bullet"/>
+      <w:lvlText w:val=""/>
+      <w:lvlJc w:val="left"/>
+      <w:pPr>
+        <w:tabs>
+          <w:tab w:val="num" w:pos="5760"/>
+        </w:tabs>
+        <w:ind w:left="5760" w:hanging="360"/>
+      </w:pPr>
+      <w:rPr>
+        <w:rFonts w:ascii="Wingdings" w:hAnsi="Wingdings" w:hint="default"/>
+        <w:sz w:val="20"/>
+      </w:rPr>
+    </w:lvl>
+    <w:lvl w:ilvl="8" w:tentative="1">
+      <w:start w:val="1"/>
+      <w:numFmt w:val="bullet"/>
+      <w:lvlText w:val=""/>
+      <w:lvlJc w:val="left"/>
+      <w:pPr>
+        <w:tabs>
+          <w:tab w:val="num" w:pos="6480"/>
+        </w:tabs>
+        <w:ind w:left="6480" w:hanging="360"/>
+      </w:pPr>
+      <w:rPr>
+        <w:rFonts w:ascii="Wingdings" w:hAnsi="Wingdings" w:hint="default"/>
+        <w:sz w:val="20"/>
+      </w:rPr>
+    </w:lvl>
+  </w:abstractNum>
   <w:num w:numId="1" w16cid:durableId="1450515960">
-    <w:abstractNumId w:val="1"/>
+    <w:abstractNumId w:val="3"/>
   </w:num>
   <w:num w:numId="2" w16cid:durableId="212038063">
     <w:abstractNumId w:val="0"/>
+  </w:num>
+  <w:num w:numId="3" w16cid:durableId="737286571">
+    <w:abstractNumId w:val="2"/>
+  </w:num>
+  <w:num w:numId="4" w16cid:durableId="337734836">
+    <w:abstractNumId w:val="1"/>
+  </w:num>
+  <w:num w:numId="5" w16cid:durableId="1643728331">
+    <w:abstractNumId w:val="4"/>
   </w:num>
 </w:numbering>
 </file>
@@ -1135,6 +2063,7 @@
   <w:style w:type="character" w:default="1" w:styleId="DefaultParagraphFont">
     <w:name w:val="Default Paragraph Font"/>
     <w:uiPriority w:val="1"/>
+    <w:semiHidden/>
     <w:unhideWhenUsed/>
   </w:style>
   <w:style w:type="table" w:default="1" w:styleId="TableNormal">

</xml_diff>

<commit_message>
silver to gold transformation
</commit_message>
<xml_diff>
--- a/reference/promptEngineering/prompts.docx
+++ b/reference/promptEngineering/prompts.docx
@@ -33,95 +33,45 @@
         </w:numPr>
       </w:pPr>
       <w:r>
-        <w:t xml:space="preserve">take my dataset in the </w:t>
-      </w:r>
-      <w:proofErr w:type="spellStart"/>
-      <w:r>
-        <w:t>dataanalytics</w:t>
-      </w:r>
-      <w:proofErr w:type="spellEnd"/>
+        <w:t xml:space="preserve">take my dataset in the dataanalytics catalog, in ml1 schema, called loan_book_dirty. This is the list of issues I want you to fix; A. three different date formats in application_date), B. </w:t>
+      </w:r>
+      <w:r>
+        <w:t xml:space="preserve">remove </w:t>
+      </w:r>
+      <w:r>
+        <w:t>duplicate rows</w:t>
+      </w:r>
+      <w:r>
+        <w:t xml:space="preserve">  (keep first occurrence only)</w:t>
+      </w:r>
+      <w:r>
+        <w:t xml:space="preserve">, C. categorical variable inconsistency </w:t>
+      </w:r>
+      <w:r>
+        <w:t>–</w:t>
+      </w:r>
       <w:r>
         <w:t xml:space="preserve"> </w:t>
       </w:r>
-      <w:proofErr w:type="spellStart"/>
-      <w:r>
-        <w:t>catalog</w:t>
-      </w:r>
-      <w:proofErr w:type="spellEnd"/>
-      <w:r>
-        <w:t xml:space="preserve">, in ml1 schema, called </w:t>
-      </w:r>
-      <w:proofErr w:type="spellStart"/>
-      <w:r>
-        <w:t>loan_book_dirty</w:t>
-      </w:r>
-      <w:proofErr w:type="spellEnd"/>
-      <w:r>
-        <w:t xml:space="preserve">. This is the list of issues I want you to fix; A. three different date formats in </w:t>
-      </w:r>
-      <w:proofErr w:type="spellStart"/>
-      <w:r>
-        <w:t>application_date</w:t>
-      </w:r>
-      <w:proofErr w:type="spellEnd"/>
-      <w:r>
-        <w:t xml:space="preserve">), B. </w:t>
-      </w:r>
-      <w:r>
-        <w:t xml:space="preserve">remove </w:t>
-      </w:r>
-      <w:r>
-        <w:t>duplicate rows</w:t>
-      </w:r>
-      <w:r>
-        <w:t xml:space="preserve">  (keep first occurrence only)</w:t>
-      </w:r>
-      <w:r>
-        <w:t xml:space="preserve">, C. categorical variable inconsistency </w:t>
+      <w:r>
+        <w:t xml:space="preserve">standardise </w:t>
+      </w:r>
+      <w:r>
+        <w:t xml:space="preserve">loan_purpose (21 variations of 7 actual categories), D. categorical variable inconsistency - </w:t>
+      </w:r>
+      <w:r>
+        <w:t>standardise</w:t>
+      </w:r>
+      <w:r>
+        <w:t xml:space="preserve"> </w:t>
+      </w:r>
+      <w:r>
+        <w:t xml:space="preserve">home_ownership (14 variations of 4 actual categories), E. wrong data type - num_open_accounts (current: double, should be: integer), F. suboptimal data type </w:t>
       </w:r>
       <w:r>
         <w:t>–</w:t>
       </w:r>
       <w:r>
-        <w:t xml:space="preserve"> </w:t>
-      </w:r>
-      <w:r>
-        <w:t xml:space="preserve">standardise </w:t>
-      </w:r>
-      <w:proofErr w:type="spellStart"/>
-      <w:r>
-        <w:t>loan_purpose</w:t>
-      </w:r>
-      <w:proofErr w:type="spellEnd"/>
-      <w:r>
-        <w:t xml:space="preserve"> (21 variations of 7 actual categories), D. categorical variable inconsistency - </w:t>
-      </w:r>
-      <w:r>
-        <w:t>standardise</w:t>
-      </w:r>
-      <w:r>
-        <w:t xml:space="preserve"> </w:t>
-      </w:r>
-      <w:proofErr w:type="spellStart"/>
-      <w:r>
-        <w:t>home_ownership</w:t>
-      </w:r>
-      <w:proofErr w:type="spellEnd"/>
-      <w:r>
-        <w:t xml:space="preserve"> (14 variations of 4 actual categories), E. wrong data type - </w:t>
-      </w:r>
-      <w:proofErr w:type="spellStart"/>
-      <w:r>
-        <w:t>num_open_accounts</w:t>
-      </w:r>
-      <w:proofErr w:type="spellEnd"/>
-      <w:r>
-        <w:t xml:space="preserve"> (current: double, should be: integer), F. suboptimal data type </w:t>
-      </w:r>
-      <w:r>
-        <w:t>–</w:t>
-      </w:r>
-      <w:r>
         <w:t xml:space="preserve"> age</w:t>
       </w:r>
       <w:r>
@@ -140,106 +90,34 @@
         <w:t xml:space="preserve">how to treat null values: </w:t>
       </w:r>
       <w:r>
-        <w:t xml:space="preserve">Create a </w:t>
-      </w:r>
-      <w:proofErr w:type="spellStart"/>
-      <w:r>
-        <w:t>income_missing</w:t>
-      </w:r>
-      <w:proofErr w:type="spellEnd"/>
-      <w:r>
-        <w:t xml:space="preserve"> flag (Boolean) and impute missing values with the median income</w:t>
+        <w:t>Create a income_missing flag (Boolean) and impute missing values with the median income</w:t>
       </w:r>
       <w:r>
         <w:t xml:space="preserve">, </w:t>
       </w:r>
       <w:r>
-        <w:t xml:space="preserve">Create a </w:t>
-      </w:r>
-      <w:proofErr w:type="spellStart"/>
-      <w:r>
-        <w:t>has_delinquency_history</w:t>
-      </w:r>
-      <w:proofErr w:type="spellEnd"/>
-      <w:r>
-        <w:t xml:space="preserve"> flag (Boolean: True = has history, False = no history) and fill missing values with -1</w:t>
+        <w:t>Create a has_delinquency_history flag (Boolean: True = has history, False = no history) and fill missing values with -1</w:t>
       </w:r>
       <w:r>
         <w:t xml:space="preserve"> (</w:t>
       </w:r>
       <w:r>
-        <w:t>Consider creating a categorical version: "</w:t>
-      </w:r>
-      <w:proofErr w:type="spellStart"/>
-      <w:r>
-        <w:t>No_History</w:t>
-      </w:r>
-      <w:proofErr w:type="spellEnd"/>
-      <w:r>
-        <w:t>", "Recent_0-12mo", "Moderate_12-36mo", "Old_36mo+"</w:t>
+        <w:t>Consider creating a categorical version: "No_History", "Recent_0-12mo", "Moderate_12-36mo", "Old_36mo+"</w:t>
       </w:r>
       <w:r>
         <w:t xml:space="preserve">), </w:t>
       </w:r>
       <w:r>
-        <w:t xml:space="preserve">Create an </w:t>
-      </w:r>
-      <w:proofErr w:type="spellStart"/>
-      <w:r>
-        <w:t>employment_missing</w:t>
-      </w:r>
-      <w:proofErr w:type="spellEnd"/>
-      <w:r>
-        <w:t xml:space="preserve"> flag and impute with 0 years (conservative approach assuming unstable employment)</w:t>
+        <w:t>Create an employment_missing flag and impute with 0 years (conservative approach assuming unstable employment)</w:t>
       </w:r>
       <w:r>
         <w:t xml:space="preserve">, </w:t>
       </w:r>
       <w:r>
-        <w:t xml:space="preserve">Create a </w:t>
-      </w:r>
-      <w:proofErr w:type="spellStart"/>
-      <w:r>
-        <w:t>num_accounts_missing</w:t>
-      </w:r>
-      <w:proofErr w:type="spellEnd"/>
-      <w:r>
-        <w:t xml:space="preserve"> flag and impute with the median number of accounts</w:t>
-      </w:r>
-      <w:r>
-        <w:t xml:space="preserve">, H. inconsistent month columns: </w:t>
-      </w:r>
-      <w:proofErr w:type="spellStart"/>
-      <w:r>
-        <w:t>months_since_oldest_account</w:t>
-      </w:r>
-      <w:proofErr w:type="spellEnd"/>
-      <w:r>
-        <w:t xml:space="preserve">, </w:t>
-      </w:r>
-      <w:proofErr w:type="spellStart"/>
-      <w:r>
-        <w:t>months_since_last_delinquency</w:t>
-      </w:r>
-      <w:proofErr w:type="spellEnd"/>
-      <w:r>
-        <w:t xml:space="preserve">, </w:t>
-      </w:r>
-      <w:proofErr w:type="spellStart"/>
-      <w:r>
-        <w:t>months_at_current_address</w:t>
-      </w:r>
-      <w:proofErr w:type="spellEnd"/>
-      <w:r>
-        <w:t xml:space="preserve">, I. High cardinality - </w:t>
-      </w:r>
-      <w:proofErr w:type="spellStart"/>
-      <w:r>
-        <w:t>branch_code_id</w:t>
-      </w:r>
-      <w:proofErr w:type="spellEnd"/>
-      <w:r>
-        <w:t xml:space="preserve">, </w:t>
+        <w:t>Create a num_accounts_missing flag and impute with the median number of accounts</w:t>
+      </w:r>
+      <w:r>
+        <w:t xml:space="preserve">, H. inconsistent month columns: months_since_oldest_account, months_since_last_delinquency, months_at_current_address, I. High cardinality - branch_code_id, </w:t>
       </w:r>
       <w:r>
         <w:t>J</w:t>
@@ -263,13 +141,8 @@
         <w:t>M</w:t>
       </w:r>
       <w:r>
-        <w:t xml:space="preserve">. Wrong Data Type - </w:t>
-      </w:r>
-      <w:proofErr w:type="spellStart"/>
-      <w:r>
-        <w:t>application_date</w:t>
-      </w:r>
-      <w:proofErr w:type="spellEnd"/>
+        <w:t>. Wrong Data Type - application_date</w:t>
+      </w:r>
       <w:r>
         <w:t>.</w:t>
       </w:r>
@@ -305,15 +178,7 @@
         <w:t xml:space="preserve"> </w:t>
       </w:r>
       <w:r>
-        <w:t>“</w:t>
-      </w:r>
-      <w:proofErr w:type="spellStart"/>
-      <w:r>
-        <w:t>loan_book_silver</w:t>
-      </w:r>
-      <w:proofErr w:type="spellEnd"/>
-      <w:r>
-        <w:t>”</w:t>
+        <w:t>“loan_book_silver”</w:t>
       </w:r>
     </w:p>
     <w:p>
@@ -353,174 +218,103 @@
         </w:numPr>
       </w:pPr>
       <w:r>
-        <w:t xml:space="preserve">take my dataset in the </w:t>
-      </w:r>
-      <w:proofErr w:type="spellStart"/>
-      <w:r>
-        <w:t>dataanalytics</w:t>
-      </w:r>
-      <w:proofErr w:type="spellEnd"/>
+        <w:t xml:space="preserve">take my dataset in the dataanalytics catalog, in ml1 schema, called </w:t>
+      </w:r>
+      <w:r>
+        <w:t>loan_book_dirty</w:t>
+      </w:r>
+      <w:r>
+        <w:t>. This is the list of issues I want you to fix;</w:t>
+      </w:r>
       <w:r>
         <w:t xml:space="preserve"> </w:t>
       </w:r>
-      <w:proofErr w:type="spellStart"/>
-      <w:r>
-        <w:t>catalog</w:t>
-      </w:r>
-      <w:proofErr w:type="spellEnd"/>
-      <w:r>
-        <w:t xml:space="preserve">, in ml1 schema, called </w:t>
-      </w:r>
-      <w:proofErr w:type="spellStart"/>
-      <w:r>
-        <w:t>loan_book_dirty</w:t>
-      </w:r>
-      <w:proofErr w:type="spellEnd"/>
-      <w:r>
-        <w:t>. This is the list of issues I want you to fix;</w:t>
+      <w:r>
+        <w:t>A. DATA TYPE FIXES:</w:t>
+      </w:r>
+      <w:r>
+        <w:t xml:space="preserve"> standardise</w:t>
+      </w:r>
+      <w:r>
+        <w:t xml:space="preserve"> application_date handling three different date formats</w:t>
+      </w:r>
+      <w:r>
+        <w:t>;</w:t>
       </w:r>
       <w:r>
         <w:t xml:space="preserve"> </w:t>
       </w:r>
       <w:r>
-        <w:t>A. DATA TYPE FIXES:</w:t>
-      </w:r>
-      <w:r>
-        <w:t xml:space="preserve"> standardise</w:t>
+        <w:t>Convert num_open_accounts from double to integer</w:t>
+      </w:r>
+      <w:r>
+        <w:t>;</w:t>
       </w:r>
       <w:r>
         <w:t xml:space="preserve"> </w:t>
       </w:r>
-      <w:proofErr w:type="spellStart"/>
-      <w:r>
-        <w:t>application_date</w:t>
-      </w:r>
-      <w:proofErr w:type="spellEnd"/>
-      <w:r>
-        <w:t xml:space="preserve"> handling three different date formats</w:t>
+      <w:r>
+        <w:t>round</w:t>
+      </w:r>
+      <w:r>
+        <w:t xml:space="preserve"> age to nearest whole number (integer)</w:t>
+      </w:r>
+      <w:r>
+        <w:t xml:space="preserve">. B. </w:t>
+      </w:r>
+      <w:r>
+        <w:t>Deduplicate by keeping only one record per applicant_id_</w:t>
+      </w:r>
+      <w:r>
+        <w:t xml:space="preserve">hash. C. </w:t>
+      </w:r>
+      <w:r>
+        <w:t>categorical standardisation</w:t>
+      </w:r>
+      <w:r>
+        <w:t>:</w:t>
+      </w:r>
+      <w:r>
+        <w:t xml:space="preserve"> </w:t>
+      </w:r>
+      <w:r>
+        <w:t>Standardi</w:t>
+      </w:r>
+      <w:r>
+        <w:t>s</w:t>
+      </w:r>
+      <w:r>
+        <w:t>e loan_purpose: consolidate 21 variations into 7 actual categories</w:t>
       </w:r>
       <w:r>
         <w:t>;</w:t>
       </w:r>
       <w:r>
+        <w:t xml:space="preserve"> Standardi</w:t>
+      </w:r>
+      <w:r>
+        <w:t>s</w:t>
+      </w:r>
+      <w:r>
+        <w:t>e home_ownership: consolidate 14 variations into 4 actual categories (MORTGAGE, RENT, OWN, OTHER)</w:t>
+      </w:r>
+      <w:r>
+        <w:t xml:space="preserve">. D. </w:t>
+      </w:r>
+      <w:r>
+        <w:t>MISSING VALUE TREATMENT:</w:t>
+      </w:r>
+      <w:r>
         <w:t xml:space="preserve"> </w:t>
       </w:r>
       <w:r>
-        <w:t xml:space="preserve">Convert </w:t>
-      </w:r>
-      <w:proofErr w:type="spellStart"/>
-      <w:r>
-        <w:t>num_open_accounts</w:t>
-      </w:r>
-      <w:proofErr w:type="spellEnd"/>
-      <w:r>
-        <w:t xml:space="preserve"> from double to integer</w:t>
-      </w:r>
-      <w:r>
-        <w:t>;</w:t>
+        <w:t>annual_income:</w:t>
       </w:r>
       <w:r>
         <w:t xml:space="preserve"> </w:t>
       </w:r>
       <w:r>
-        <w:t>round</w:t>
-      </w:r>
-      <w:r>
-        <w:t xml:space="preserve"> age to nearest whole number (integer)</w:t>
-      </w:r>
-      <w:r>
-        <w:t xml:space="preserve">. B. </w:t>
-      </w:r>
-      <w:r>
-        <w:t>Deduplicate by keeping only one record per </w:t>
-      </w:r>
-      <w:proofErr w:type="spellStart"/>
-      <w:r>
-        <w:t>applicant_id_</w:t>
-      </w:r>
-      <w:r>
-        <w:t>hash</w:t>
-      </w:r>
-      <w:proofErr w:type="spellEnd"/>
-      <w:r>
-        <w:t xml:space="preserve">. C. </w:t>
-      </w:r>
-      <w:r>
-        <w:t>categorical standardisation</w:t>
-      </w:r>
-      <w:r>
-        <w:t>:</w:t>
-      </w:r>
-      <w:r>
-        <w:t xml:space="preserve"> </w:t>
-      </w:r>
-      <w:r>
-        <w:t>Standardi</w:t>
-      </w:r>
-      <w:r>
-        <w:t>s</w:t>
-      </w:r>
-      <w:r>
-        <w:t xml:space="preserve">e </w:t>
-      </w:r>
-      <w:proofErr w:type="spellStart"/>
-      <w:r>
-        <w:t>loan_purpose</w:t>
-      </w:r>
-      <w:proofErr w:type="spellEnd"/>
-      <w:r>
-        <w:t>: consolidate 21 variations into 7 actual categories</w:t>
-      </w:r>
-      <w:r>
-        <w:t>;</w:t>
-      </w:r>
-      <w:r>
-        <w:t xml:space="preserve"> Standardi</w:t>
-      </w:r>
-      <w:r>
-        <w:t>s</w:t>
-      </w:r>
-      <w:r>
-        <w:t xml:space="preserve">e </w:t>
-      </w:r>
-      <w:proofErr w:type="spellStart"/>
-      <w:r>
-        <w:t>home_ownership</w:t>
-      </w:r>
-      <w:proofErr w:type="spellEnd"/>
-      <w:r>
-        <w:t>: consolidate 14 variations into 4 actual categories (MORTGAGE, RENT, OWN, OTHER)</w:t>
-      </w:r>
-      <w:r>
-        <w:t xml:space="preserve">. D. </w:t>
-      </w:r>
-      <w:r>
-        <w:t>MISSING VALUE TREATMENT:</w:t>
-      </w:r>
-      <w:r>
-        <w:t xml:space="preserve"> </w:t>
-      </w:r>
-      <w:proofErr w:type="spellStart"/>
-      <w:r>
-        <w:t>annual_income</w:t>
-      </w:r>
-      <w:proofErr w:type="spellEnd"/>
-      <w:r>
-        <w:t>:</w:t>
-      </w:r>
-      <w:r>
-        <w:t xml:space="preserve"> </w:t>
-      </w:r>
-      <w:r>
-        <w:t xml:space="preserve">Create </w:t>
-      </w:r>
-      <w:proofErr w:type="spellStart"/>
-      <w:r>
-        <w:t>income_missing</w:t>
-      </w:r>
-      <w:proofErr w:type="spellEnd"/>
-      <w:r>
-        <w:t xml:space="preserve"> flag </w:t>
+        <w:t xml:space="preserve">Create income_missing flag </w:t>
       </w:r>
       <w:r>
         <w:lastRenderedPageBreak/>
@@ -530,32 +324,28 @@
         <w:t>;</w:t>
       </w:r>
       <w:r>
+        <w:t xml:space="preserve"> months_since_last_delinquency: Create has_delinquency_history flag (Boolean)</w:t>
+      </w:r>
+      <w:r>
         <w:t xml:space="preserve"> </w:t>
       </w:r>
-      <w:proofErr w:type="spellStart"/>
-      <w:r>
-        <w:t>months_since_last_delinquency</w:t>
-      </w:r>
-      <w:proofErr w:type="spellEnd"/>
-      <w:r>
-        <w:t xml:space="preserve">: Create </w:t>
-      </w:r>
-      <w:proofErr w:type="spellStart"/>
-      <w:r>
-        <w:t>has_delinquency_history</w:t>
-      </w:r>
-      <w:proofErr w:type="spellEnd"/>
-      <w:r>
-        <w:t xml:space="preserve"> flag (Boolean)</w:t>
+      <w:r>
+        <w:t>fill nulls with -1, then RECODE -1 to 999 to avoid negative values in logistic regressio</w:t>
+      </w:r>
+      <w:r>
+        <w:t>n</w:t>
+      </w:r>
+      <w:r>
+        <w:t>;</w:t>
+      </w:r>
+      <w:r>
+        <w:t xml:space="preserve"> employment_length_years: Create employment_missing flag (Boolean)</w:t>
       </w:r>
       <w:r>
         <w:t xml:space="preserve"> </w:t>
       </w:r>
       <w:r>
-        <w:t>fill nulls with -1, then RECODE -1 to 999 to avoid negative values in logistic regressio</w:t>
-      </w:r>
-      <w:r>
-        <w:t>n</w:t>
+        <w:t>impute nulls with 0</w:t>
       </w:r>
       <w:r>
         <w:t>;</w:t>
@@ -563,297 +353,128 @@
       <w:r>
         <w:t xml:space="preserve"> </w:t>
       </w:r>
-      <w:proofErr w:type="spellStart"/>
-      <w:r>
-        <w:t>employment_length_years</w:t>
-      </w:r>
-      <w:proofErr w:type="spellEnd"/>
-      <w:r>
-        <w:t xml:space="preserve">: Create </w:t>
-      </w:r>
-      <w:proofErr w:type="spellStart"/>
-      <w:r>
-        <w:t>employment_missing</w:t>
-      </w:r>
-      <w:proofErr w:type="spellEnd"/>
-      <w:r>
-        <w:t xml:space="preserve"> flag (Boolean)</w:t>
+      <w:r>
+        <w:t xml:space="preserve"> num_open_accounts: Create num_accounts_missing flag (Boolean)</w:t>
       </w:r>
       <w:r>
         <w:t xml:space="preserve"> </w:t>
       </w:r>
       <w:r>
-        <w:t>impute nulls with 0</w:t>
+        <w:t>impute nulls with median</w:t>
+      </w:r>
+      <w:r>
+        <w:t xml:space="preserve">. E. </w:t>
+      </w:r>
+      <w:r>
+        <w:t>DATA QUALITY FIXES: Cap credit_utilisation_pct at 100</w:t>
+      </w:r>
+      <w:r>
+        <w:t>%</w:t>
+      </w:r>
+      <w:r>
+        <w:t xml:space="preserve"> (currently has values up to 106.2%)</w:t>
+      </w:r>
+      <w:r>
+        <w:t xml:space="preserve">; </w:t>
+      </w:r>
+      <w:r>
+        <w:t>Ensure all month columns are non-negative: months_since_oldest_account, months_since_last_delinquency (after recoding -1 to 999), months_at_current_address</w:t>
+      </w:r>
+      <w:r>
+        <w:t xml:space="preserve">. F. </w:t>
+      </w:r>
+      <w:r>
+        <w:t>OUTLIER TREATMENT</w:t>
+      </w:r>
+      <w:r>
+        <w:t xml:space="preserve">: </w:t>
+      </w:r>
+      <w:r>
+        <w:t>Cap annual_income at 99th percentile to handle extreme outliers (max is $2M)</w:t>
+      </w:r>
+      <w:r>
+        <w:t xml:space="preserve">; </w:t>
+      </w:r>
+      <w:r>
+        <w:t>Cap loan_amount at 99th percentile to handle extreme values (max is $497K)</w:t>
+      </w:r>
+      <w:r>
+        <w:t xml:space="preserve">; </w:t>
+      </w:r>
+      <w:r>
+        <w:t>Cap total_revolving_balance at 99th percentile</w:t>
+      </w:r>
+      <w:r>
+        <w:t xml:space="preserve">. G. </w:t>
+      </w:r>
+      <w:r>
+        <w:t>FEATURE ENGINEERING FOR INTERPRETABILITY:</w:t>
+      </w:r>
+      <w:r>
+        <w:t xml:space="preserve"> </w:t>
+      </w:r>
+      <w:r>
+        <w:t>Create delinquency_category: "No_History" (months_since_last_delinquency = 999), "Recent_0-12mo" (0-12), "Moderate_12-36mo" (12-36), "Old_36mo+" (&gt;36)</w:t>
+      </w:r>
+      <w:r>
+        <w:t xml:space="preserve">; </w:t>
+      </w:r>
+      <w:r>
+        <w:t>Create incomplete_observation_window flag: TRUE if application_date is after 2022-12-31 (loans from late 2023 may not have full 12-month default observation)</w:t>
+      </w:r>
+      <w:r>
+        <w:t xml:space="preserve">. H. </w:t>
+      </w:r>
+      <w:r>
+        <w:t>TRAIN/TEST SPLIT INTEGRITY:</w:t>
+      </w:r>
+      <w:r>
+        <w:t xml:space="preserve"> </w:t>
+      </w:r>
+      <w:r>
+        <w:t>Ensure the existing 'set' column (train/test) is preserved</w:t>
       </w:r>
       <w:r>
         <w:t>;</w:t>
       </w:r>
       <w:r>
+        <w:t xml:space="preserve"> After deduplication, verify no applicant_id_hash appears in both train and test</w:t>
+      </w:r>
+      <w:r>
+        <w:t xml:space="preserve">. I. </w:t>
+      </w:r>
+      <w:r>
+        <w:t>FINAL VALIDATION:</w:t>
+      </w:r>
+      <w:r>
         <w:t xml:space="preserve"> </w:t>
       </w:r>
       <w:r>
+        <w:t>Verify no duplicate applicant_id_hash remains</w:t>
+      </w:r>
+      <w:r>
+        <w:t>,</w:t>
+      </w:r>
+      <w:r>
         <w:t xml:space="preserve"> </w:t>
       </w:r>
-      <w:proofErr w:type="spellStart"/>
-      <w:r>
-        <w:t>num_open_accounts</w:t>
-      </w:r>
-      <w:proofErr w:type="spellEnd"/>
-      <w:r>
-        <w:t xml:space="preserve">: Create </w:t>
-      </w:r>
-      <w:proofErr w:type="spellStart"/>
-      <w:r>
-        <w:t>num_accounts_missing</w:t>
-      </w:r>
-      <w:proofErr w:type="spellEnd"/>
-      <w:r>
-        <w:t xml:space="preserve"> flag (Boolean)</w:t>
-      </w:r>
-      <w:r>
-        <w:t xml:space="preserve"> </w:t>
-      </w:r>
-      <w:r>
-        <w:t>impute nulls with median</w:t>
-      </w:r>
-      <w:r>
-        <w:t xml:space="preserve">. E. </w:t>
-      </w:r>
-      <w:r>
-        <w:t xml:space="preserve">DATA QUALITY FIXES: Cap </w:t>
-      </w:r>
-      <w:proofErr w:type="spellStart"/>
-      <w:r>
-        <w:t>credit_utilisation_pct</w:t>
-      </w:r>
-      <w:proofErr w:type="spellEnd"/>
-      <w:r>
-        <w:t xml:space="preserve"> at 100</w:t>
-      </w:r>
-      <w:r>
-        <w:t>%</w:t>
-      </w:r>
-      <w:r>
-        <w:t xml:space="preserve"> (currently has values up to 106.2%)</w:t>
-      </w:r>
-      <w:r>
-        <w:t xml:space="preserve">; </w:t>
-      </w:r>
-      <w:r>
-        <w:t xml:space="preserve">Ensure all month columns are non-negative: </w:t>
-      </w:r>
-      <w:proofErr w:type="spellStart"/>
-      <w:r>
-        <w:t>months_since_oldest_account</w:t>
-      </w:r>
-      <w:proofErr w:type="spellEnd"/>
+      <w:r>
+        <w:t>verify</w:t>
+      </w:r>
+      <w:r>
+        <w:t xml:space="preserve"> no null values in critical features (after imputation)</w:t>
+      </w:r>
       <w:r>
         <w:t xml:space="preserve">, </w:t>
       </w:r>
-      <w:proofErr w:type="spellStart"/>
-      <w:r>
-        <w:t>months_since_last_delinquency</w:t>
-      </w:r>
-      <w:proofErr w:type="spellEnd"/>
-      <w:r>
-        <w:t xml:space="preserve"> (after recoding -1 to 999), </w:t>
-      </w:r>
-      <w:proofErr w:type="spellStart"/>
-      <w:r>
-        <w:t>months_at_current_address</w:t>
-      </w:r>
-      <w:proofErr w:type="spellEnd"/>
-      <w:r>
-        <w:t xml:space="preserve">. F. </w:t>
-      </w:r>
-      <w:r>
-        <w:t>OUTLIER TREATMENT</w:t>
-      </w:r>
-      <w:r>
-        <w:t xml:space="preserve">: </w:t>
-      </w:r>
-      <w:r>
-        <w:t xml:space="preserve">Cap </w:t>
-      </w:r>
-      <w:proofErr w:type="spellStart"/>
-      <w:r>
-        <w:t>annual_income</w:t>
-      </w:r>
-      <w:proofErr w:type="spellEnd"/>
-      <w:r>
-        <w:t xml:space="preserve"> at 99th percentile to handle extreme outliers (max is $2M)</w:t>
-      </w:r>
-      <w:r>
-        <w:t xml:space="preserve">; </w:t>
-      </w:r>
-      <w:r>
-        <w:t xml:space="preserve">Cap </w:t>
-      </w:r>
-      <w:proofErr w:type="spellStart"/>
-      <w:r>
-        <w:t>loan_amount</w:t>
-      </w:r>
-      <w:proofErr w:type="spellEnd"/>
-      <w:r>
-        <w:t xml:space="preserve"> at 99th percentile to handle extreme values (max is $497K)</w:t>
-      </w:r>
-      <w:r>
-        <w:t xml:space="preserve">; </w:t>
-      </w:r>
-      <w:r>
-        <w:t xml:space="preserve">Cap </w:t>
-      </w:r>
-      <w:proofErr w:type="spellStart"/>
-      <w:r>
-        <w:t>total_revolving_balance</w:t>
-      </w:r>
-      <w:proofErr w:type="spellEnd"/>
-      <w:r>
-        <w:t xml:space="preserve"> at 99th percentile</w:t>
-      </w:r>
-      <w:r>
-        <w:t xml:space="preserve">. G. </w:t>
-      </w:r>
-      <w:r>
-        <w:t>FEATURE ENGINEERING FOR INTERPRETABILITY:</w:t>
-      </w:r>
-      <w:r>
-        <w:t xml:space="preserve"> </w:t>
-      </w:r>
-      <w:r>
-        <w:t xml:space="preserve">Create </w:t>
-      </w:r>
-      <w:proofErr w:type="spellStart"/>
-      <w:r>
-        <w:t>delinquency_category</w:t>
-      </w:r>
-      <w:proofErr w:type="spellEnd"/>
-      <w:r>
-        <w:t>: "</w:t>
-      </w:r>
-      <w:proofErr w:type="spellStart"/>
-      <w:r>
-        <w:t>No_History</w:t>
-      </w:r>
-      <w:proofErr w:type="spellEnd"/>
-      <w:r>
-        <w:t>" (</w:t>
-      </w:r>
-      <w:proofErr w:type="spellStart"/>
-      <w:r>
-        <w:t>months_since_last_delinquency</w:t>
-      </w:r>
-      <w:proofErr w:type="spellEnd"/>
-      <w:r>
-        <w:t xml:space="preserve"> = 999), "Recent_0-12mo" (0-12), "Moderate_12-36mo" (12-36), "Old_36mo+" (&gt;36)</w:t>
-      </w:r>
-      <w:r>
-        <w:t xml:space="preserve">; </w:t>
-      </w:r>
-      <w:r>
-        <w:t xml:space="preserve">Create </w:t>
-      </w:r>
-      <w:proofErr w:type="spellStart"/>
-      <w:r>
-        <w:t>incomplete_observation_window</w:t>
-      </w:r>
-      <w:proofErr w:type="spellEnd"/>
-      <w:r>
-        <w:t xml:space="preserve"> flag: TRUE if </w:t>
-      </w:r>
-      <w:proofErr w:type="spellStart"/>
-      <w:r>
-        <w:t>application_date</w:t>
-      </w:r>
-      <w:proofErr w:type="spellEnd"/>
-      <w:r>
-        <w:t xml:space="preserve"> is after 2022-12-31 (loans from late 2023 may not have full 12-month default observation)</w:t>
-      </w:r>
-      <w:r>
-        <w:t xml:space="preserve">. H. </w:t>
-      </w:r>
-      <w:r>
-        <w:t>TRAIN/TEST SPLIT INTEGRITY:</w:t>
-      </w:r>
-      <w:r>
-        <w:t xml:space="preserve"> </w:t>
-      </w:r>
-      <w:r>
-        <w:t>Ensure the existing 'set' column (train/test) is preserved</w:t>
-      </w:r>
-      <w:r>
-        <w:t>;</w:t>
-      </w:r>
-      <w:r>
-        <w:t xml:space="preserve"> After deduplication, verify no </w:t>
-      </w:r>
-      <w:proofErr w:type="spellStart"/>
-      <w:r>
-        <w:t>applicant_id_hash</w:t>
-      </w:r>
-      <w:proofErr w:type="spellEnd"/>
-      <w:r>
-        <w:t xml:space="preserve"> appears in both train and test</w:t>
-      </w:r>
-      <w:r>
-        <w:t xml:space="preserve">. I. </w:t>
-      </w:r>
-      <w:r>
-        <w:t>FINAL VALIDATION:</w:t>
-      </w:r>
-      <w:r>
-        <w:t xml:space="preserve"> </w:t>
-      </w:r>
-      <w:r>
-        <w:t xml:space="preserve">Verify no duplicate </w:t>
-      </w:r>
-      <w:proofErr w:type="spellStart"/>
-      <w:r>
-        <w:t>applicant_id_hash</w:t>
-      </w:r>
-      <w:proofErr w:type="spellEnd"/>
-      <w:r>
-        <w:t xml:space="preserve"> remains</w:t>
-      </w:r>
-      <w:r>
-        <w:t>,</w:t>
-      </w:r>
-      <w:r>
-        <w:t xml:space="preserve"> </w:t>
-      </w:r>
-      <w:r>
-        <w:t>verify</w:t>
-      </w:r>
-      <w:r>
-        <w:t xml:space="preserve"> no null values in critical features (after imputation)</w:t>
+      <w:r>
+        <w:t>Verify credit_utilisation_pct &lt;= 100</w:t>
       </w:r>
       <w:r>
         <w:t xml:space="preserve">, </w:t>
       </w:r>
       <w:r>
-        <w:t xml:space="preserve">Verify </w:t>
-      </w:r>
-      <w:proofErr w:type="spellStart"/>
-      <w:r>
-        <w:t>credit_utilisation_pct</w:t>
-      </w:r>
-      <w:proofErr w:type="spellEnd"/>
-      <w:r>
-        <w:t xml:space="preserve"> &lt;= 100</w:t>
-      </w:r>
-      <w:r>
-        <w:t xml:space="preserve">, </w:t>
-      </w:r>
-      <w:r>
-        <w:t xml:space="preserve">Verify all month columns &gt;= 0 (except </w:t>
-      </w:r>
-      <w:proofErr w:type="spellStart"/>
-      <w:r>
-        <w:t>months_since_last_delinquency</w:t>
-      </w:r>
-      <w:proofErr w:type="spellEnd"/>
-      <w:r>
-        <w:t xml:space="preserve"> which should be 999 for no history)</w:t>
+        <w:t>Verify all month columns &gt;= 0 (except months_since_last_delinquency which should be 999 for no history)</w:t>
       </w:r>
       <w:r>
         <w:t>. U</w:t>
@@ -887,13 +508,146 @@
     <w:p>
       <w:pPr>
         <w:ind w:left="360"/>
-      </w:pPr>
+        <w:rPr>
+          <w:b/>
+          <w:bCs/>
+        </w:rPr>
+      </w:pPr>
+      <w:r>
+        <w:rPr>
+          <w:b/>
+          <w:bCs/>
+        </w:rPr>
+        <w:t>silver_to_gold_transformation_</w:t>
+      </w:r>
+      <w:r>
+        <w:rPr>
+          <w:b/>
+          <w:bCs/>
+        </w:rPr>
+        <w:t>and_logistic_model_</w:t>
+      </w:r>
+      <w:r>
+        <w:rPr>
+          <w:b/>
+          <w:bCs/>
+        </w:rPr>
+        <w:t>prompt</w:t>
+      </w:r>
     </w:p>
     <w:p>
       <w:r>
+        <w:t>Take my dataset in the dataanalytics catalog, in ml1 schema, called loan_book_silver. Move it from Silver to Gold layer by performing the following:</w:t>
+      </w:r>
+      <w:r>
+        <w:br/>
+        <w:t>1. Investigate the dataset to confirm risk patterns identified in EDA:</w:t>
+      </w:r>
+      <w:r>
+        <w:br/>
+        <w:t>- Strong features: interest_rate, delinquency_category, annual_income</w:t>
+      </w:r>
+      <w:r>
+        <w:br/>
+        <w:t>- Medium features: age, num_delinquencies_2yr, months_since_oldest_account, employment_length_years, months_since_last_delinquency</w:t>
+      </w:r>
+      <w:r>
+        <w:br/>
+        <w:t>- Weak features: pct_accounts_current, dti_ratio, num_open_accounts, loan_amount, num_hard_inquiries_6mo, credit_utilisation_pct, total_revolving_balance</w:t>
+      </w:r>
+      <w:r>
+        <w:br/>
+        <w:t>- Exclude useless features (IV &lt; 0.02) such as home_ownership, region, branch_code_id, loan_purpose, etc.</w:t>
+      </w:r>
+      <w:r>
+        <w:br/>
+        <w:t>2. Apply feature engineering:</w:t>
+      </w:r>
+      <w:r>
+        <w:br/>
+        <w:t>- WoE encoding for categorical variables (e.g. delinquency_category, home_ownership if retained for business context).</w:t>
+      </w:r>
+      <w:r>
+        <w:br/>
+      </w:r>
+      <w:r>
+        <w:lastRenderedPageBreak/>
+        <w:t>- Binning for continuous variables (e.g. age, annual_income, interest_rate).</w:t>
+      </w:r>
+      <w:r>
+        <w:br/>
+        <w:t>- Ratio and statistical features (e.g. debt-to-income ratio, credit utilisation).</w:t>
+      </w:r>
+      <w:r>
+        <w:br/>
+        <w:t>- Behavioural features (e.g. number of delinquencies, months since oldest account).</w:t>
+      </w:r>
+      <w:r>
+        <w:br/>
+        <w:t>- Flags and indicators (e.g. high utilisation, new account).</w:t>
+      </w:r>
+      <w:r>
+        <w:br/>
+        <w:t>3. Avoid target leakage:</w:t>
+      </w:r>
+      <w:r>
+        <w:br/>
+        <w:t>- Remove any features derived after default_flag event.</w:t>
+      </w:r>
+      <w:r>
+        <w:br/>
+        <w:t>- Ensure time-based splits are correctly handled.</w:t>
+      </w:r>
+      <w:r>
+        <w:br/>
+        <w:t>4. Deliverables:</w:t>
+      </w:r>
+      <w:r>
+        <w:br/>
+        <w:t>- Gold-layer dataset with engineered features.</w:t>
+      </w:r>
+      <w:r>
+        <w:br/>
+        <w:t>- Feature list with IV and WoE summaries.</w:t>
+      </w:r>
+      <w:r>
+        <w:br/>
+        <w:t>- Logistic regression model trained on selected features.</w:t>
+      </w:r>
+      <w:r>
+        <w:br/>
+        <w:t>- Model performance metrics (AUC, Precision, Recall, F1, Gini). Use python and don't show print statements.</w:t>
+      </w:r>
+      <w:r>
         <w:t xml:space="preserve">   </w:t>
       </w:r>
     </w:p>
+    <w:p/>
+    <w:p>
+      <w:pPr>
+        <w:pStyle w:val="ListParagraph"/>
+        <w:numPr>
+          <w:ilvl w:val="0"/>
+          <w:numId w:val="4"/>
+        </w:numPr>
+      </w:pPr>
+      <w:r>
+        <w:t>Write this table to a new table in the same schema and call it</w:t>
+      </w:r>
+      <w:r>
+        <w:t xml:space="preserve"> </w:t>
+      </w:r>
+      <w:r>
+        <w:t>“loan_book_</w:t>
+      </w:r>
+      <w:r>
+        <w:t>gold</w:t>
+      </w:r>
+      <w:r>
+        <w:t>”</w:t>
+      </w:r>
+    </w:p>
+    <w:p/>
     <w:p/>
     <w:p>
       <w:r>
@@ -1006,6 +760,92 @@
     </w:lvl>
   </w:abstractNum>
   <w:abstractNum w:abstractNumId="1" w15:restartNumberingAfterBreak="0">
+    <w:nsid w:val="2D985B00"/>
+    <w:multiLevelType w:val="hybridMultilevel"/>
+    <w:tmpl w:val="8B280344"/>
+    <w:lvl w:ilvl="0" w:tplc="FFFFFFFF">
+      <w:start w:val="1"/>
+      <w:numFmt w:val="decimal"/>
+      <w:lvlText w:val="%1."/>
+      <w:lvlJc w:val="left"/>
+      <w:pPr>
+        <w:ind w:left="720" w:hanging="360"/>
+      </w:pPr>
+    </w:lvl>
+    <w:lvl w:ilvl="1" w:tplc="FFFFFFFF" w:tentative="1">
+      <w:start w:val="1"/>
+      <w:numFmt w:val="lowerLetter"/>
+      <w:lvlText w:val="%2."/>
+      <w:lvlJc w:val="left"/>
+      <w:pPr>
+        <w:ind w:left="1440" w:hanging="360"/>
+      </w:pPr>
+    </w:lvl>
+    <w:lvl w:ilvl="2" w:tplc="FFFFFFFF" w:tentative="1">
+      <w:start w:val="1"/>
+      <w:numFmt w:val="lowerRoman"/>
+      <w:lvlText w:val="%3."/>
+      <w:lvlJc w:val="right"/>
+      <w:pPr>
+        <w:ind w:left="2160" w:hanging="180"/>
+      </w:pPr>
+    </w:lvl>
+    <w:lvl w:ilvl="3" w:tplc="FFFFFFFF" w:tentative="1">
+      <w:start w:val="1"/>
+      <w:numFmt w:val="decimal"/>
+      <w:lvlText w:val="%4."/>
+      <w:lvlJc w:val="left"/>
+      <w:pPr>
+        <w:ind w:left="2880" w:hanging="360"/>
+      </w:pPr>
+    </w:lvl>
+    <w:lvl w:ilvl="4" w:tplc="FFFFFFFF" w:tentative="1">
+      <w:start w:val="1"/>
+      <w:numFmt w:val="lowerLetter"/>
+      <w:lvlText w:val="%5."/>
+      <w:lvlJc w:val="left"/>
+      <w:pPr>
+        <w:ind w:left="3600" w:hanging="360"/>
+      </w:pPr>
+    </w:lvl>
+    <w:lvl w:ilvl="5" w:tplc="FFFFFFFF" w:tentative="1">
+      <w:start w:val="1"/>
+      <w:numFmt w:val="lowerRoman"/>
+      <w:lvlText w:val="%6."/>
+      <w:lvlJc w:val="right"/>
+      <w:pPr>
+        <w:ind w:left="4320" w:hanging="180"/>
+      </w:pPr>
+    </w:lvl>
+    <w:lvl w:ilvl="6" w:tplc="FFFFFFFF" w:tentative="1">
+      <w:start w:val="1"/>
+      <w:numFmt w:val="decimal"/>
+      <w:lvlText w:val="%7."/>
+      <w:lvlJc w:val="left"/>
+      <w:pPr>
+        <w:ind w:left="5040" w:hanging="360"/>
+      </w:pPr>
+    </w:lvl>
+    <w:lvl w:ilvl="7" w:tplc="FFFFFFFF" w:tentative="1">
+      <w:start w:val="1"/>
+      <w:numFmt w:val="lowerLetter"/>
+      <w:lvlText w:val="%8."/>
+      <w:lvlJc w:val="left"/>
+      <w:pPr>
+        <w:ind w:left="5760" w:hanging="360"/>
+      </w:pPr>
+    </w:lvl>
+    <w:lvl w:ilvl="8" w:tplc="FFFFFFFF" w:tentative="1">
+      <w:start w:val="1"/>
+      <w:numFmt w:val="lowerRoman"/>
+      <w:lvlText w:val="%9."/>
+      <w:lvlJc w:val="right"/>
+      <w:pPr>
+        <w:ind w:left="6480" w:hanging="180"/>
+      </w:pPr>
+    </w:lvl>
+  </w:abstractNum>
+  <w:abstractNum w:abstractNumId="2" w15:restartNumberingAfterBreak="0">
     <w:nsid w:val="2F98299B"/>
     <w:multiLevelType w:val="hybridMultilevel"/>
     <w:tmpl w:val="00EEF028"/>
@@ -1094,7 +934,7 @@
       </w:pPr>
     </w:lvl>
   </w:abstractNum>
-  <w:abstractNum w:abstractNumId="2" w15:restartNumberingAfterBreak="0">
+  <w:abstractNum w:abstractNumId="3" w15:restartNumberingAfterBreak="0">
     <w:nsid w:val="3CF95D15"/>
     <w:multiLevelType w:val="hybridMultilevel"/>
     <w:tmpl w:val="8B280344"/>
@@ -1180,7 +1020,7 @@
       </w:pPr>
     </w:lvl>
   </w:abstractNum>
-  <w:abstractNum w:abstractNumId="3" w15:restartNumberingAfterBreak="0">
+  <w:abstractNum w:abstractNumId="4" w15:restartNumberingAfterBreak="0">
     <w:nsid w:val="59D3470A"/>
     <w:multiLevelType w:val="hybridMultilevel"/>
     <w:tmpl w:val="1FEC12C6"/>
@@ -1293,7 +1133,7 @@
       </w:rPr>
     </w:lvl>
   </w:abstractNum>
-  <w:abstractNum w:abstractNumId="4" w15:restartNumberingAfterBreak="0">
+  <w:abstractNum w:abstractNumId="5" w15:restartNumberingAfterBreak="0">
     <w:nsid w:val="76DC353B"/>
     <w:multiLevelType w:val="multilevel"/>
     <w:tmpl w:val="9F3E9490"/>
@@ -1443,19 +1283,22 @@
     </w:lvl>
   </w:abstractNum>
   <w:num w:numId="1" w16cid:durableId="1450515960">
-    <w:abstractNumId w:val="3"/>
+    <w:abstractNumId w:val="4"/>
   </w:num>
   <w:num w:numId="2" w16cid:durableId="212038063">
     <w:abstractNumId w:val="0"/>
   </w:num>
   <w:num w:numId="3" w16cid:durableId="737286571">
+    <w:abstractNumId w:val="3"/>
+  </w:num>
+  <w:num w:numId="4" w16cid:durableId="337734836">
     <w:abstractNumId w:val="2"/>
   </w:num>
-  <w:num w:numId="4" w16cid:durableId="337734836">
+  <w:num w:numId="5" w16cid:durableId="1643728331">
+    <w:abstractNumId w:val="5"/>
+  </w:num>
+  <w:num w:numId="6" w16cid:durableId="1669400875">
     <w:abstractNumId w:val="1"/>
-  </w:num>
-  <w:num w:numId="5" w16cid:durableId="1643728331">
-    <w:abstractNumId w:val="4"/>
   </w:num>
 </w:numbering>
 </file>
@@ -2063,7 +1906,6 @@
   <w:style w:type="character" w:default="1" w:styleId="DefaultParagraphFont">
     <w:name w:val="Default Paragraph Font"/>
     <w:uiPriority w:val="1"/>
-    <w:semiHidden/>
     <w:unhideWhenUsed/>
   </w:style>
   <w:style w:type="table" w:default="1" w:styleId="TableNormal">

</xml_diff>